<commit_message>
docs(p1): D014 single equation image correction
eq08_singularity.png rendered "w = prod(sigma_i)" but sigma_i is defined as
a nonzero eigenvalue of Jr Jr^T, so the expression must carry a square root
to equal the Yoshikawa manipulability (product of the six singular values).
Regenerated the image as w = sqrt(prod_{i=1..6} sigma_i), matching the
report's textual Eq. (36) and P1_EQUATION_AUDIT.md.

Equation numbers (36)(37), image layout/page, pagination, all numerical
results and the PARTIALLY_VERIFIED acceptance are unchanged. Rebuilt
docx/pdf (22 pages, 17 embedded images), re-checked pagination and page
numbers, 47 tests pass.
</commit_message>
<xml_diff>
--- a/p1/reports/final/P1_FINAL_REPORT.docx
+++ b/p1/reports/final/P1_FINAL_REPORT.docx
@@ -5501,7 +5501,7 @@
         <w:rPr/>
         <w:drawing>
           <wp:inline distT="0" distB="0" distL="0" distR="0">
-            <wp:extent cx="3924300" cy="676275"/>
+            <wp:extent cx="4219575" cy="762000"/>
             <wp:effectExtent l="0" t="0" r="0" b="0"/>
             <wp:docPr id="10" name="图像10" descr=""/>
             <wp:cNvGraphicFramePr>
@@ -5525,7 +5525,7 @@
                   <pic:spPr bwMode="auto">
                     <a:xfrm>
                       <a:off x="0" y="0"/>
-                      <a:ext cx="3924300" cy="676275"/>
+                      <a:ext cx="4219575" cy="762000"/>
                     </a:xfrm>
                     <a:prstGeom prst="rect">
                       <a:avLst/>

</xml_diff>